<commit_message>
Recover Science Books and EE Series work lost to a concurrent git reset
Another session working on this same repo ran a merge + reset that
discarded uncommitted changes repo-wide. This restores the Science
Books and EE Series content from the stash that session left behind
(stash@{0}), specifically excluding the Relativistic Investigation
Bureau portion of that stash, which was stale backup/junk already
superseded by that session's own later cleanup commits.

Science Books: new QED course lessons 62-67 (Vacuum Polarization
through Renormalization), manuscript status/description files,
figures, and the editing/analysis scripts used to build them.

EE Series: edits to Foundations_Book1.docx,
Core_Circuits_and_Components_Book2.docx, the Basic Physics manuscript,
and a logged "Book2 gap-list closeout" pass in _BOOK PLAN.txt.

Co-Authored-By: Claude Sonnet 5 <noreply@anthropic.com>
</commit_message>
<xml_diff>
--- a/EE - Series/Core_Circuits_and_Components_Book2.docx
+++ b/EE - Series/Core_Circuits_and_Components_Book2.docx
@@ -1077,7 +1077,7 @@
           <w:noProof/>
         </w:rPr>
         <w:drawing>
-          <wp:inline distT="0" distB="0" distL="0" distR="0" wp14:anchorId="6F8BDB75" wp14:editId="636F1CF3">
+          <wp:inline distT="0" distB="0" distL="0" distR="0" wp14:anchorId="7FEF32BC" wp14:editId="167A42A5">
             <wp:extent cx="4381500" cy="2143125"/>
             <wp:effectExtent l="0" t="0" r="0" b="0"/>
             <wp:docPr id="1" name="Picture 1"/>
@@ -1497,10 +1497,10 @@
         </w:rPr>
         <w:lastRenderedPageBreak/>
         <w:drawing>
-          <wp:inline distT="0" distB="0" distL="0" distR="0" wp14:anchorId="38B68373" wp14:editId="4CDD9F34">
+          <wp:inline distT="0" distB="0" distL="0" distR="0" wp14:anchorId="6B5B8097" wp14:editId="30611A17">
             <wp:extent cx="4381500" cy="2686050"/>
             <wp:effectExtent l="0" t="0" r="0" b="0"/>
-            <wp:docPr id="546639834" name="Picture 546639834"/>
+            <wp:docPr id="1332120156" name="Picture 1332120156"/>
             <wp:cNvGraphicFramePr>
               <a:graphicFrameLocks xmlns:a="http://schemas.openxmlformats.org/drawingml/2006/main" noChangeAspect="1"/>
             </wp:cNvGraphicFramePr>
@@ -1846,10 +1846,10 @@
           <w:noProof/>
         </w:rPr>
         <w:drawing>
-          <wp:inline distT="0" distB="0" distL="0" distR="0" wp14:anchorId="6D317238" wp14:editId="1CF7B081">
+          <wp:inline distT="0" distB="0" distL="0" distR="0" wp14:anchorId="1832BA4D" wp14:editId="6D21DC8F">
             <wp:extent cx="4381500" cy="2495550"/>
             <wp:effectExtent l="0" t="0" r="0" b="0"/>
-            <wp:docPr id="25129941" name="Picture 25129941"/>
+            <wp:docPr id="273354224" name="Picture 273354224"/>
             <wp:cNvGraphicFramePr>
               <a:graphicFrameLocks xmlns:a="http://schemas.openxmlformats.org/drawingml/2006/main" noChangeAspect="1"/>
             </wp:cNvGraphicFramePr>
@@ -2191,10 +2191,10 @@
           <w:noProof/>
         </w:rPr>
         <w:drawing>
-          <wp:inline distT="0" distB="0" distL="0" distR="0" wp14:anchorId="653AF68A" wp14:editId="2210F662">
+          <wp:inline distT="0" distB="0" distL="0" distR="0" wp14:anchorId="471749D1" wp14:editId="6377B81B">
             <wp:extent cx="4381500" cy="1495425"/>
             <wp:effectExtent l="0" t="0" r="0" b="0"/>
-            <wp:docPr id="1894647868" name="Picture 1894647868"/>
+            <wp:docPr id="217017985" name="Picture 217017985"/>
             <wp:cNvGraphicFramePr>
               <a:graphicFrameLocks xmlns:a="http://schemas.openxmlformats.org/drawingml/2006/main" noChangeAspect="1"/>
             </wp:cNvGraphicFramePr>
@@ -2308,10 +2308,10 @@
           <w:noProof/>
         </w:rPr>
         <w:drawing>
-          <wp:inline distT="0" distB="0" distL="0" distR="0" wp14:anchorId="7FC8D6CE" wp14:editId="56E5886F">
+          <wp:inline distT="0" distB="0" distL="0" distR="0" wp14:anchorId="02DED435" wp14:editId="397F940D">
             <wp:extent cx="4381500" cy="2085975"/>
             <wp:effectExtent l="0" t="0" r="0" b="0"/>
-            <wp:docPr id="999238552" name="Picture 999238552"/>
+            <wp:docPr id="40349768" name="Picture 40349768"/>
             <wp:cNvGraphicFramePr>
               <a:graphicFrameLocks xmlns:a="http://schemas.openxmlformats.org/drawingml/2006/main" noChangeAspect="1"/>
             </wp:cNvGraphicFramePr>
@@ -2722,10 +2722,10 @@
         </w:rPr>
         <w:lastRenderedPageBreak/>
         <w:drawing>
-          <wp:inline distT="0" distB="0" distL="0" distR="0" wp14:anchorId="3EAFDDDF" wp14:editId="7BDF7BCA">
+          <wp:inline distT="0" distB="0" distL="0" distR="0" wp14:anchorId="6E5F834D" wp14:editId="613D03E0">
             <wp:extent cx="4381500" cy="2114550"/>
             <wp:effectExtent l="0" t="0" r="0" b="0"/>
-            <wp:docPr id="400328300" name="Picture 400328300"/>
+            <wp:docPr id="2126307757" name="Picture 2126307757"/>
             <wp:cNvGraphicFramePr>
               <a:graphicFrameLocks xmlns:a="http://schemas.openxmlformats.org/drawingml/2006/main" noChangeAspect="1"/>
             </wp:cNvGraphicFramePr>
@@ -2857,10 +2857,10 @@
           <w:noProof/>
         </w:rPr>
         <w:drawing>
-          <wp:inline distT="0" distB="0" distL="0" distR="0" wp14:anchorId="479CF509" wp14:editId="6B712F76">
+          <wp:inline distT="0" distB="0" distL="0" distR="0" wp14:anchorId="7CCA9F95" wp14:editId="045916F6">
             <wp:extent cx="4381500" cy="2305050"/>
             <wp:effectExtent l="0" t="0" r="0" b="0"/>
-            <wp:docPr id="1475940564" name="Picture 1475940564"/>
+            <wp:docPr id="1364302103" name="Picture 1364302103"/>
             <wp:cNvGraphicFramePr>
               <a:graphicFrameLocks xmlns:a="http://schemas.openxmlformats.org/drawingml/2006/main" noChangeAspect="1"/>
             </wp:cNvGraphicFramePr>
@@ -3174,10 +3174,10 @@
           <w:noProof/>
         </w:rPr>
         <w:drawing>
-          <wp:inline distT="0" distB="0" distL="0" distR="0" wp14:anchorId="7036AFDC" wp14:editId="7D057DA2">
+          <wp:inline distT="0" distB="0" distL="0" distR="0" wp14:anchorId="68D28A58" wp14:editId="70124DE6">
             <wp:extent cx="4381500" cy="2409825"/>
             <wp:effectExtent l="0" t="0" r="0" b="0"/>
-            <wp:docPr id="1467010259" name="Picture 1467010259"/>
+            <wp:docPr id="1542072721" name="Picture 1542072721"/>
             <wp:cNvGraphicFramePr>
               <a:graphicFrameLocks xmlns:a="http://schemas.openxmlformats.org/drawingml/2006/main" noChangeAspect="1"/>
             </wp:cNvGraphicFramePr>
@@ -3338,10 +3338,10 @@
           <w:noProof/>
         </w:rPr>
         <w:drawing>
-          <wp:inline distT="0" distB="0" distL="0" distR="0" wp14:anchorId="56B1B3A6" wp14:editId="7A45D49F">
+          <wp:inline distT="0" distB="0" distL="0" distR="0" wp14:anchorId="09435B08" wp14:editId="7807F9BA">
             <wp:extent cx="4381500" cy="1171575"/>
             <wp:effectExtent l="0" t="0" r="0" b="0"/>
-            <wp:docPr id="80755898" name="Picture 80755898"/>
+            <wp:docPr id="470290883" name="Picture 470290883"/>
             <wp:cNvGraphicFramePr>
               <a:graphicFrameLocks xmlns:a="http://schemas.openxmlformats.org/drawingml/2006/main" noChangeAspect="1"/>
             </wp:cNvGraphicFramePr>
@@ -3771,10 +3771,10 @@
           <w:noProof/>
         </w:rPr>
         <w:drawing>
-          <wp:inline distT="0" distB="0" distL="0" distR="0" wp14:anchorId="63FAD87D" wp14:editId="29500FA6">
+          <wp:inline distT="0" distB="0" distL="0" distR="0" wp14:anchorId="65043AC5" wp14:editId="6E4F8E7A">
             <wp:extent cx="4381500" cy="1485900"/>
             <wp:effectExtent l="0" t="0" r="0" b="0"/>
-            <wp:docPr id="2016415667" name="Picture 2016415667"/>
+            <wp:docPr id="1729192388" name="Picture 1729192388"/>
             <wp:cNvGraphicFramePr>
               <a:graphicFrameLocks xmlns:a="http://schemas.openxmlformats.org/drawingml/2006/main" noChangeAspect="1"/>
             </wp:cNvGraphicFramePr>
@@ -4156,10 +4156,10 @@
           <w:noProof/>
         </w:rPr>
         <w:drawing>
-          <wp:inline distT="0" distB="0" distL="0" distR="0" wp14:anchorId="7F751DC8" wp14:editId="4B0470A0">
+          <wp:inline distT="0" distB="0" distL="0" distR="0" wp14:anchorId="7D19C245" wp14:editId="603EDD41">
             <wp:extent cx="4381500" cy="2085975"/>
             <wp:effectExtent l="0" t="0" r="0" b="0"/>
-            <wp:docPr id="1048439208" name="Picture 1048439208"/>
+            <wp:docPr id="1301355980" name="Picture 1301355980"/>
             <wp:cNvGraphicFramePr>
               <a:graphicFrameLocks xmlns:a="http://schemas.openxmlformats.org/drawingml/2006/main" noChangeAspect="1"/>
             </wp:cNvGraphicFramePr>
@@ -4515,10 +4515,10 @@
           <w:noProof/>
         </w:rPr>
         <w:drawing>
-          <wp:inline distT="0" distB="0" distL="0" distR="0" wp14:anchorId="0461846B" wp14:editId="2C21ABA1">
+          <wp:inline distT="0" distB="0" distL="0" distR="0" wp14:anchorId="66BB011E" wp14:editId="2F26DB6E">
             <wp:extent cx="4381500" cy="2076450"/>
             <wp:effectExtent l="0" t="0" r="0" b="0"/>
-            <wp:docPr id="714993695" name="Picture 714993695"/>
+            <wp:docPr id="555754848" name="Picture 555754848"/>
             <wp:cNvGraphicFramePr>
               <a:graphicFrameLocks xmlns:a="http://schemas.openxmlformats.org/drawingml/2006/main" noChangeAspect="1"/>
             </wp:cNvGraphicFramePr>
@@ -5531,6 +5531,21 @@
           <w:b/>
           <w:bCs/>
         </w:rPr>
+        <w:t xml:space="preserve">Class 2 dielectric — </w:t>
+      </w:r>
+      <w:r>
+        <w:t>A ceramic capacitor dielectric family (X7R, Y5V, and similar) that packs more capacitance into a given size than Class 1 types, at the cost of capacitance that decreases as DC bias voltage rises.</w:t>
+      </w:r>
+    </w:p>
+    <w:p>
+      <w:pPr>
+        <w:spacing w:after="200" w:line="276" w:lineRule="auto"/>
+      </w:pPr>
+      <w:r>
+        <w:rPr>
+          <w:b/>
+          <w:bCs/>
+        </w:rPr>
         <w:t xml:space="preserve">Clipping — </w:t>
       </w:r>
       <w:r>
@@ -5711,6 +5726,21 @@
           <w:b/>
           <w:bCs/>
         </w:rPr>
+        <w:t xml:space="preserve">Regeneration — </w:t>
+      </w:r>
+      <w:r>
+        <w:t>A digital gate reading a noisy input and producing a fresh, full-strength output level, which is why noise does not accumulate through a long chain of gates.</w:t>
+      </w:r>
+    </w:p>
+    <w:p>
+      <w:pPr>
+        <w:spacing w:after="200" w:line="276" w:lineRule="auto"/>
+      </w:pPr>
+      <w:r>
+        <w:rPr>
+          <w:b/>
+          <w:bCs/>
+        </w:rPr>
         <w:t xml:space="preserve">Self-resonant frequency (SRF) — </w:t>
       </w:r>
       <w:r>
@@ -5726,6 +5756,7 @@
           <w:b/>
           <w:bCs/>
         </w:rPr>
+        <w:lastRenderedPageBreak/>
         <w:t xml:space="preserve">Sequential circuit — </w:t>
       </w:r>
       <w:r>
@@ -5756,7 +5787,6 @@
           <w:b/>
           <w:bCs/>
         </w:rPr>
-        <w:lastRenderedPageBreak/>
         <w:t xml:space="preserve">Tolerance — </w:t>
       </w:r>
       <w:r>
@@ -5788,7 +5818,7 @@
         <w:spacing w:after="200" w:line="276" w:lineRule="auto"/>
       </w:pPr>
       <w:r>
-        <w:t>A circuit is biased to a fixed operating point before a smaller signal rides on top of it; the distance from that point to the nearer output rail is its headroom, and headroom sets the largest undistorted signal the stage can pass.</w:t>
+        <w:t>A circuit is biased to a fixed operating point before a smaller signal rides on top of it; the distance from that point to the nearer output rail is its headroom, and headroom sets the largest undistorted signal the stage can pass; gain and headroom trade against each other for a fixed pair of supply rails, and exceeding that limit produces distortion, most visibly as clipping.</w:t>
       </w:r>
     </w:p>
     <w:p>
@@ -5907,6 +5937,7 @@
         <w:spacing w:after="200" w:line="276" w:lineRule="auto"/>
       </w:pPr>
       <w:r>
+        <w:lastRenderedPageBreak/>
         <w:t>Every capacitor carries a maximum voltage rating, and for a polarized electrolytic that rating applies to the correct polarity only; a real capacitor's equivalent series resistance and inductance also give it a self-resonant frequency, above which it stops behaving like a capacitor, and Class 2 ceramic types lose capacitance as DC bias voltage rises.</w:t>
       </w:r>
     </w:p>
@@ -5916,7 +5947,6 @@
         <w:spacing w:before="360" w:after="160"/>
       </w:pPr>
       <w:r>
-        <w:lastRenderedPageBreak/>
         <w:t>Chapter 9</w:t>
       </w:r>
     </w:p>
@@ -6035,10 +6065,172 @@
 <file path=word/numbering.xml><?xml version="1.0" encoding="utf-8"?>
 <w:numbering xmlns:wpc="http://schemas.microsoft.com/office/word/2010/wordprocessingCanvas" xmlns:cx="http://schemas.microsoft.com/office/drawing/2014/chartex" xmlns:cx1="http://schemas.microsoft.com/office/drawing/2015/9/8/chartex" xmlns:cx2="http://schemas.microsoft.com/office/drawing/2015/10/21/chartex" xmlns:cx3="http://schemas.microsoft.com/office/drawing/2016/5/9/chartex" xmlns:cx4="http://schemas.microsoft.com/office/drawing/2016/5/10/chartex" xmlns:cx5="http://schemas.microsoft.com/office/drawing/2016/5/11/chartex" xmlns:cx6="http://schemas.microsoft.com/office/drawing/2016/5/12/chartex" xmlns:cx7="http://schemas.microsoft.com/office/drawing/2016/5/13/chartex" xmlns:cx8="http://schemas.microsoft.com/office/drawing/2016/5/14/chartex" xmlns:mc="http://schemas.openxmlformats.org/markup-compatibility/2006" xmlns:aink="http://schemas.microsoft.com/office/drawing/2016/ink" xmlns:am3d="http://schemas.microsoft.com/office/drawing/2017/model3d" xmlns:o="urn:schemas-microsoft-com:office:office" xmlns:oel="http://schemas.microsoft.com/office/2019/extlst" xmlns:r="http://schemas.openxmlformats.org/officeDocument/2006/relationships" xmlns:m="http://schemas.openxmlformats.org/officeDocument/2006/math" xmlns:v="urn:schemas-microsoft-com:vml" xmlns:wp14="http://schemas.microsoft.com/office/word/2010/wordprocessingDrawing" xmlns:wp="http://schemas.openxmlformats.org/drawingml/2006/wordprocessingDrawing" xmlns:w10="urn:schemas-microsoft-com:office:word" xmlns:w="http://schemas.openxmlformats.org/wordprocessingml/2006/main" xmlns:w14="http://schemas.microsoft.com/office/word/2010/wordml" xmlns:w15="http://schemas.microsoft.com/office/word/2012/wordml" xmlns:w16cex="http://schemas.microsoft.com/office/word/2018/wordml/cex" xmlns:w16cid="http://schemas.microsoft.com/office/word/2016/wordml/cid" xmlns:w16="http://schemas.microsoft.com/office/word/2018/wordml" xmlns:w16du="http://schemas.microsoft.com/office/word/2023/wordml/word16du" xmlns:w16sdtdh="http://schemas.microsoft.com/office/word/2020/wordml/sdtdatahash" xmlns:w16sdtfl="http://schemas.microsoft.com/office/word/2024/wordml/sdtformatlock" xmlns:w16se="http://schemas.microsoft.com/office/word/2015/wordml/symex" xmlns:wpg="http://schemas.microsoft.com/office/word/2010/wordprocessingGroup" xmlns:wpi="http://schemas.microsoft.com/office/word/2010/wordprocessingInk" xmlns:wne="http://schemas.microsoft.com/office/word/2006/wordml" xmlns:wps="http://schemas.microsoft.com/office/word/2010/wordprocessingShape" mc:Ignorable="w14 w15 w16se w16cid w16 w16cex w16sdtdh w16sdtfl w16du wp14">
   <w:abstractNum w:abstractNumId="0" w15:restartNumberingAfterBreak="0">
-    <w:nsid w:val="044F70B2"/>
+    <w:nsid w:val="072D736D"/>
     <w:multiLevelType w:val="hybridMultilevel"/>
-    <w:tmpl w:val="4920AAD6"/>
-    <w:lvl w:ilvl="0" w:tplc="850809E4">
+    <w:tmpl w:val="C18CC95C"/>
+    <w:lvl w:ilvl="0" w:tplc="4C1E702A">
+      <w:start w:val="1"/>
+      <w:numFmt w:val="decimal"/>
+      <w:lvlText w:val="%1."/>
+      <w:lvlJc w:val="left"/>
+      <w:pPr>
+        <w:ind w:left="720" w:hanging="360"/>
+      </w:pPr>
+    </w:lvl>
+    <w:lvl w:ilvl="1" w:tplc="7F462C0E">
+      <w:numFmt w:val="decimal"/>
+      <w:lvlText w:val=""/>
+      <w:lvlJc w:val="left"/>
+    </w:lvl>
+    <w:lvl w:ilvl="2" w:tplc="5B80AF10">
+      <w:numFmt w:val="decimal"/>
+      <w:lvlText w:val=""/>
+      <w:lvlJc w:val="left"/>
+    </w:lvl>
+    <w:lvl w:ilvl="3" w:tplc="7D50EC9E">
+      <w:numFmt w:val="decimal"/>
+      <w:lvlText w:val=""/>
+      <w:lvlJc w:val="left"/>
+    </w:lvl>
+    <w:lvl w:ilvl="4" w:tplc="2ABCD8A2">
+      <w:numFmt w:val="decimal"/>
+      <w:lvlText w:val=""/>
+      <w:lvlJc w:val="left"/>
+    </w:lvl>
+    <w:lvl w:ilvl="5" w:tplc="3810482E">
+      <w:numFmt w:val="decimal"/>
+      <w:lvlText w:val=""/>
+      <w:lvlJc w:val="left"/>
+    </w:lvl>
+    <w:lvl w:ilvl="6" w:tplc="92D43CEA">
+      <w:numFmt w:val="decimal"/>
+      <w:lvlText w:val=""/>
+      <w:lvlJc w:val="left"/>
+    </w:lvl>
+    <w:lvl w:ilvl="7" w:tplc="53728DE6">
+      <w:numFmt w:val="decimal"/>
+      <w:lvlText w:val=""/>
+      <w:lvlJc w:val="left"/>
+    </w:lvl>
+    <w:lvl w:ilvl="8" w:tplc="4A6A348A">
+      <w:numFmt w:val="decimal"/>
+      <w:lvlText w:val=""/>
+      <w:lvlJc w:val="left"/>
+    </w:lvl>
+  </w:abstractNum>
+  <w:abstractNum w:abstractNumId="1" w15:restartNumberingAfterBreak="0">
+    <w:nsid w:val="1A141639"/>
+    <w:multiLevelType w:val="hybridMultilevel"/>
+    <w:tmpl w:val="7EA4F90C"/>
+    <w:lvl w:ilvl="0" w:tplc="06E27CB4">
+      <w:start w:val="1"/>
+      <w:numFmt w:val="decimal"/>
+      <w:lvlText w:val="%1."/>
+      <w:lvlJc w:val="left"/>
+      <w:pPr>
+        <w:ind w:left="720" w:hanging="360"/>
+      </w:pPr>
+    </w:lvl>
+    <w:lvl w:ilvl="1" w:tplc="ACA6F73C">
+      <w:numFmt w:val="decimal"/>
+      <w:lvlText w:val=""/>
+      <w:lvlJc w:val="left"/>
+    </w:lvl>
+    <w:lvl w:ilvl="2" w:tplc="47620AFA">
+      <w:numFmt w:val="decimal"/>
+      <w:lvlText w:val=""/>
+      <w:lvlJc w:val="left"/>
+    </w:lvl>
+    <w:lvl w:ilvl="3" w:tplc="8EE8F3EC">
+      <w:numFmt w:val="decimal"/>
+      <w:lvlText w:val=""/>
+      <w:lvlJc w:val="left"/>
+    </w:lvl>
+    <w:lvl w:ilvl="4" w:tplc="2EFE2798">
+      <w:numFmt w:val="decimal"/>
+      <w:lvlText w:val=""/>
+      <w:lvlJc w:val="left"/>
+    </w:lvl>
+    <w:lvl w:ilvl="5" w:tplc="55E4858E">
+      <w:numFmt w:val="decimal"/>
+      <w:lvlText w:val=""/>
+      <w:lvlJc w:val="left"/>
+    </w:lvl>
+    <w:lvl w:ilvl="6" w:tplc="40AC8FAE">
+      <w:numFmt w:val="decimal"/>
+      <w:lvlText w:val=""/>
+      <w:lvlJc w:val="left"/>
+    </w:lvl>
+    <w:lvl w:ilvl="7" w:tplc="A3A22EE2">
+      <w:numFmt w:val="decimal"/>
+      <w:lvlText w:val=""/>
+      <w:lvlJc w:val="left"/>
+    </w:lvl>
+    <w:lvl w:ilvl="8" w:tplc="D85851CA">
+      <w:numFmt w:val="decimal"/>
+      <w:lvlText w:val=""/>
+      <w:lvlJc w:val="left"/>
+    </w:lvl>
+  </w:abstractNum>
+  <w:abstractNum w:abstractNumId="2" w15:restartNumberingAfterBreak="0">
+    <w:nsid w:val="28E81805"/>
+    <w:multiLevelType w:val="hybridMultilevel"/>
+    <w:tmpl w:val="57CEF758"/>
+    <w:lvl w:ilvl="0" w:tplc="6C0EF11E">
+      <w:start w:val="1"/>
+      <w:numFmt w:val="decimal"/>
+      <w:lvlText w:val="%1."/>
+      <w:lvlJc w:val="left"/>
+      <w:pPr>
+        <w:ind w:left="720" w:hanging="360"/>
+      </w:pPr>
+    </w:lvl>
+    <w:lvl w:ilvl="1" w:tplc="CF568F46">
+      <w:numFmt w:val="decimal"/>
+      <w:lvlText w:val=""/>
+      <w:lvlJc w:val="left"/>
+    </w:lvl>
+    <w:lvl w:ilvl="2" w:tplc="068A5388">
+      <w:numFmt w:val="decimal"/>
+      <w:lvlText w:val=""/>
+      <w:lvlJc w:val="left"/>
+    </w:lvl>
+    <w:lvl w:ilvl="3" w:tplc="0C2EB018">
+      <w:numFmt w:val="decimal"/>
+      <w:lvlText w:val=""/>
+      <w:lvlJc w:val="left"/>
+    </w:lvl>
+    <w:lvl w:ilvl="4" w:tplc="07382E00">
+      <w:numFmt w:val="decimal"/>
+      <w:lvlText w:val=""/>
+      <w:lvlJc w:val="left"/>
+    </w:lvl>
+    <w:lvl w:ilvl="5" w:tplc="2EFAB10E">
+      <w:numFmt w:val="decimal"/>
+      <w:lvlText w:val=""/>
+      <w:lvlJc w:val="left"/>
+    </w:lvl>
+    <w:lvl w:ilvl="6" w:tplc="02A0FDBA">
+      <w:numFmt w:val="decimal"/>
+      <w:lvlText w:val=""/>
+      <w:lvlJc w:val="left"/>
+    </w:lvl>
+    <w:lvl w:ilvl="7" w:tplc="7F0EC016">
+      <w:numFmt w:val="decimal"/>
+      <w:lvlText w:val=""/>
+      <w:lvlJc w:val="left"/>
+    </w:lvl>
+    <w:lvl w:ilvl="8" w:tplc="986045C8">
+      <w:numFmt w:val="decimal"/>
+      <w:lvlText w:val=""/>
+      <w:lvlJc w:val="left"/>
+    </w:lvl>
+  </w:abstractNum>
+  <w:abstractNum w:abstractNumId="3" w15:restartNumberingAfterBreak="0">
+    <w:nsid w:val="37AF674A"/>
+    <w:multiLevelType w:val="hybridMultilevel"/>
+    <w:tmpl w:val="A6AE11F4"/>
+    <w:lvl w:ilvl="0" w:tplc="2E560884">
       <w:start w:val="1"/>
       <w:numFmt w:val="bullet"/>
       <w:lvlText w:val="●"/>
@@ -6047,7 +6239,7 @@
         <w:ind w:left="720" w:hanging="360"/>
       </w:pPr>
     </w:lvl>
-    <w:lvl w:ilvl="1" w:tplc="DB5E56A6">
+    <w:lvl w:ilvl="1" w:tplc="14FEB844">
       <w:start w:val="1"/>
       <w:numFmt w:val="bullet"/>
       <w:lvlText w:val="○"/>
@@ -6056,7 +6248,7 @@
         <w:ind w:left="1440" w:hanging="360"/>
       </w:pPr>
     </w:lvl>
-    <w:lvl w:ilvl="2" w:tplc="ACEE9812">
+    <w:lvl w:ilvl="2" w:tplc="7C380EC2">
       <w:start w:val="1"/>
       <w:numFmt w:val="bullet"/>
       <w:lvlText w:val="■"/>
@@ -6065,7 +6257,7 @@
         <w:ind w:left="2160" w:hanging="360"/>
       </w:pPr>
     </w:lvl>
-    <w:lvl w:ilvl="3" w:tplc="5BCE5D84">
+    <w:lvl w:ilvl="3" w:tplc="A8C4DCEE">
       <w:start w:val="1"/>
       <w:numFmt w:val="bullet"/>
       <w:lvlText w:val="●"/>
@@ -6074,7 +6266,7 @@
         <w:ind w:left="2880" w:hanging="360"/>
       </w:pPr>
     </w:lvl>
-    <w:lvl w:ilvl="4" w:tplc="08A63254">
+    <w:lvl w:ilvl="4" w:tplc="499C3BEA">
       <w:start w:val="1"/>
       <w:numFmt w:val="bullet"/>
       <w:lvlText w:val="○"/>
@@ -6083,7 +6275,7 @@
         <w:ind w:left="3600" w:hanging="360"/>
       </w:pPr>
     </w:lvl>
-    <w:lvl w:ilvl="5" w:tplc="08E45182">
+    <w:lvl w:ilvl="5" w:tplc="F802F1F2">
       <w:start w:val="1"/>
       <w:numFmt w:val="bullet"/>
       <w:lvlText w:val="■"/>
@@ -6092,7 +6284,7 @@
         <w:ind w:left="4320" w:hanging="360"/>
       </w:pPr>
     </w:lvl>
-    <w:lvl w:ilvl="6" w:tplc="83583C2C">
+    <w:lvl w:ilvl="6" w:tplc="677C9F30">
       <w:start w:val="1"/>
       <w:numFmt w:val="bullet"/>
       <w:lvlText w:val="●"/>
@@ -6101,7 +6293,7 @@
         <w:ind w:left="5040" w:hanging="360"/>
       </w:pPr>
     </w:lvl>
-    <w:lvl w:ilvl="7" w:tplc="D94857D4">
+    <w:lvl w:ilvl="7" w:tplc="5D2CE140">
       <w:start w:val="1"/>
       <w:numFmt w:val="bullet"/>
       <w:lvlText w:val="●"/>
@@ -6110,7 +6302,7 @@
         <w:ind w:left="5760" w:hanging="360"/>
       </w:pPr>
     </w:lvl>
-    <w:lvl w:ilvl="8" w:tplc="C41AA752">
+    <w:lvl w:ilvl="8" w:tplc="CEEA8C1C">
       <w:start w:val="1"/>
       <w:numFmt w:val="bullet"/>
       <w:lvlText w:val="●"/>
@@ -6120,11 +6312,11 @@
       </w:pPr>
     </w:lvl>
   </w:abstractNum>
-  <w:abstractNum w:abstractNumId="1" w15:restartNumberingAfterBreak="0">
-    <w:nsid w:val="0A2E3C78"/>
+  <w:abstractNum w:abstractNumId="4" w15:restartNumberingAfterBreak="0">
+    <w:nsid w:val="40857F5F"/>
     <w:multiLevelType w:val="hybridMultilevel"/>
-    <w:tmpl w:val="051C6340"/>
-    <w:lvl w:ilvl="0" w:tplc="F54626CC">
+    <w:tmpl w:val="465EE284"/>
+    <w:lvl w:ilvl="0" w:tplc="A498D802">
       <w:start w:val="1"/>
       <w:numFmt w:val="decimal"/>
       <w:lvlText w:val="%1."/>
@@ -6133,214 +6325,52 @@
         <w:ind w:left="720" w:hanging="360"/>
       </w:pPr>
     </w:lvl>
-    <w:lvl w:ilvl="1" w:tplc="AF1C3668">
+    <w:lvl w:ilvl="1" w:tplc="45149D94">
       <w:numFmt w:val="decimal"/>
       <w:lvlText w:val=""/>
       <w:lvlJc w:val="left"/>
     </w:lvl>
-    <w:lvl w:ilvl="2" w:tplc="92F67DC2">
+    <w:lvl w:ilvl="2" w:tplc="D9925624">
       <w:numFmt w:val="decimal"/>
       <w:lvlText w:val=""/>
       <w:lvlJc w:val="left"/>
     </w:lvl>
-    <w:lvl w:ilvl="3" w:tplc="F7A4F93C">
+    <w:lvl w:ilvl="3" w:tplc="1ABADAD6">
       <w:numFmt w:val="decimal"/>
       <w:lvlText w:val=""/>
       <w:lvlJc w:val="left"/>
     </w:lvl>
-    <w:lvl w:ilvl="4" w:tplc="304AE89A">
+    <w:lvl w:ilvl="4" w:tplc="E49253FE">
       <w:numFmt w:val="decimal"/>
       <w:lvlText w:val=""/>
       <w:lvlJc w:val="left"/>
     </w:lvl>
-    <w:lvl w:ilvl="5" w:tplc="E8F8EF32">
+    <w:lvl w:ilvl="5" w:tplc="B4E67EAA">
       <w:numFmt w:val="decimal"/>
       <w:lvlText w:val=""/>
       <w:lvlJc w:val="left"/>
     </w:lvl>
-    <w:lvl w:ilvl="6" w:tplc="0B02BF82">
+    <w:lvl w:ilvl="6" w:tplc="CFE28C40">
       <w:numFmt w:val="decimal"/>
       <w:lvlText w:val=""/>
       <w:lvlJc w:val="left"/>
     </w:lvl>
-    <w:lvl w:ilvl="7" w:tplc="757ECE1E">
+    <w:lvl w:ilvl="7" w:tplc="DC68040A">
       <w:numFmt w:val="decimal"/>
       <w:lvlText w:val=""/>
       <w:lvlJc w:val="left"/>
     </w:lvl>
-    <w:lvl w:ilvl="8" w:tplc="CB285468">
-      <w:numFmt w:val="decimal"/>
-      <w:lvlText w:val=""/>
-      <w:lvlJc w:val="left"/>
-    </w:lvl>
-  </w:abstractNum>
-  <w:abstractNum w:abstractNumId="2" w15:restartNumberingAfterBreak="0">
-    <w:nsid w:val="0B0E4C86"/>
-    <w:multiLevelType w:val="hybridMultilevel"/>
-    <w:tmpl w:val="E5160940"/>
-    <w:lvl w:ilvl="0" w:tplc="2A267A90">
-      <w:start w:val="1"/>
-      <w:numFmt w:val="decimal"/>
-      <w:lvlText w:val="%1."/>
-      <w:lvlJc w:val="left"/>
-      <w:pPr>
-        <w:ind w:left="720" w:hanging="360"/>
-      </w:pPr>
-    </w:lvl>
-    <w:lvl w:ilvl="1" w:tplc="75EA0564">
-      <w:numFmt w:val="decimal"/>
-      <w:lvlText w:val=""/>
-      <w:lvlJc w:val="left"/>
-    </w:lvl>
-    <w:lvl w:ilvl="2" w:tplc="3B940DBE">
-      <w:numFmt w:val="decimal"/>
-      <w:lvlText w:val=""/>
-      <w:lvlJc w:val="left"/>
-    </w:lvl>
-    <w:lvl w:ilvl="3" w:tplc="A6440796">
-      <w:numFmt w:val="decimal"/>
-      <w:lvlText w:val=""/>
-      <w:lvlJc w:val="left"/>
-    </w:lvl>
-    <w:lvl w:ilvl="4" w:tplc="79A423FE">
-      <w:numFmt w:val="decimal"/>
-      <w:lvlText w:val=""/>
-      <w:lvlJc w:val="left"/>
-    </w:lvl>
-    <w:lvl w:ilvl="5" w:tplc="3EE2E1B0">
-      <w:numFmt w:val="decimal"/>
-      <w:lvlText w:val=""/>
-      <w:lvlJc w:val="left"/>
-    </w:lvl>
-    <w:lvl w:ilvl="6" w:tplc="D24E881A">
-      <w:numFmt w:val="decimal"/>
-      <w:lvlText w:val=""/>
-      <w:lvlJc w:val="left"/>
-    </w:lvl>
-    <w:lvl w:ilvl="7" w:tplc="D4403D0E">
-      <w:numFmt w:val="decimal"/>
-      <w:lvlText w:val=""/>
-      <w:lvlJc w:val="left"/>
-    </w:lvl>
-    <w:lvl w:ilvl="8" w:tplc="8DEC30C0">
-      <w:numFmt w:val="decimal"/>
-      <w:lvlText w:val=""/>
-      <w:lvlJc w:val="left"/>
-    </w:lvl>
-  </w:abstractNum>
-  <w:abstractNum w:abstractNumId="3" w15:restartNumberingAfterBreak="0">
-    <w:nsid w:val="1AB9603D"/>
-    <w:multiLevelType w:val="hybridMultilevel"/>
-    <w:tmpl w:val="9B3E3D52"/>
-    <w:lvl w:ilvl="0" w:tplc="E01C0EE2">
-      <w:start w:val="1"/>
-      <w:numFmt w:val="decimal"/>
-      <w:lvlText w:val="%1."/>
-      <w:lvlJc w:val="left"/>
-      <w:pPr>
-        <w:ind w:left="720" w:hanging="360"/>
-      </w:pPr>
-    </w:lvl>
-    <w:lvl w:ilvl="1" w:tplc="5582E632">
-      <w:numFmt w:val="decimal"/>
-      <w:lvlText w:val=""/>
-      <w:lvlJc w:val="left"/>
-    </w:lvl>
-    <w:lvl w:ilvl="2" w:tplc="9198153A">
-      <w:numFmt w:val="decimal"/>
-      <w:lvlText w:val=""/>
-      <w:lvlJc w:val="left"/>
-    </w:lvl>
-    <w:lvl w:ilvl="3" w:tplc="BE00B94C">
-      <w:numFmt w:val="decimal"/>
-      <w:lvlText w:val=""/>
-      <w:lvlJc w:val="left"/>
-    </w:lvl>
-    <w:lvl w:ilvl="4" w:tplc="20522F64">
-      <w:numFmt w:val="decimal"/>
-      <w:lvlText w:val=""/>
-      <w:lvlJc w:val="left"/>
-    </w:lvl>
-    <w:lvl w:ilvl="5" w:tplc="76AE9130">
-      <w:numFmt w:val="decimal"/>
-      <w:lvlText w:val=""/>
-      <w:lvlJc w:val="left"/>
-    </w:lvl>
-    <w:lvl w:ilvl="6" w:tplc="825CA90C">
-      <w:numFmt w:val="decimal"/>
-      <w:lvlText w:val=""/>
-      <w:lvlJc w:val="left"/>
-    </w:lvl>
-    <w:lvl w:ilvl="7" w:tplc="D3D8A27C">
-      <w:numFmt w:val="decimal"/>
-      <w:lvlText w:val=""/>
-      <w:lvlJc w:val="left"/>
-    </w:lvl>
-    <w:lvl w:ilvl="8" w:tplc="ED3C9626">
-      <w:numFmt w:val="decimal"/>
-      <w:lvlText w:val=""/>
-      <w:lvlJc w:val="left"/>
-    </w:lvl>
-  </w:abstractNum>
-  <w:abstractNum w:abstractNumId="4" w15:restartNumberingAfterBreak="0">
-    <w:nsid w:val="27977322"/>
-    <w:multiLevelType w:val="hybridMultilevel"/>
-    <w:tmpl w:val="5A0618BC"/>
-    <w:lvl w:ilvl="0" w:tplc="45FE75D0">
-      <w:start w:val="1"/>
-      <w:numFmt w:val="decimal"/>
-      <w:lvlText w:val="%1."/>
-      <w:lvlJc w:val="left"/>
-      <w:pPr>
-        <w:ind w:left="720" w:hanging="360"/>
-      </w:pPr>
-    </w:lvl>
-    <w:lvl w:ilvl="1" w:tplc="2F52C592">
-      <w:numFmt w:val="decimal"/>
-      <w:lvlText w:val=""/>
-      <w:lvlJc w:val="left"/>
-    </w:lvl>
-    <w:lvl w:ilvl="2" w:tplc="EBC6B8AE">
-      <w:numFmt w:val="decimal"/>
-      <w:lvlText w:val=""/>
-      <w:lvlJc w:val="left"/>
-    </w:lvl>
-    <w:lvl w:ilvl="3" w:tplc="9C6C5C2A">
-      <w:numFmt w:val="decimal"/>
-      <w:lvlText w:val=""/>
-      <w:lvlJc w:val="left"/>
-    </w:lvl>
-    <w:lvl w:ilvl="4" w:tplc="35E26A2A">
-      <w:numFmt w:val="decimal"/>
-      <w:lvlText w:val=""/>
-      <w:lvlJc w:val="left"/>
-    </w:lvl>
-    <w:lvl w:ilvl="5" w:tplc="3B1C2E98">
-      <w:numFmt w:val="decimal"/>
-      <w:lvlText w:val=""/>
-      <w:lvlJc w:val="left"/>
-    </w:lvl>
-    <w:lvl w:ilvl="6" w:tplc="E8B4DE14">
-      <w:numFmt w:val="decimal"/>
-      <w:lvlText w:val=""/>
-      <w:lvlJc w:val="left"/>
-    </w:lvl>
-    <w:lvl w:ilvl="7" w:tplc="2E26DDB4">
-      <w:numFmt w:val="decimal"/>
-      <w:lvlText w:val=""/>
-      <w:lvlJc w:val="left"/>
-    </w:lvl>
-    <w:lvl w:ilvl="8" w:tplc="EDFC5EC0">
+    <w:lvl w:ilvl="8" w:tplc="51A69D58">
       <w:numFmt w:val="decimal"/>
       <w:lvlText w:val=""/>
       <w:lvlJc w:val="left"/>
     </w:lvl>
   </w:abstractNum>
   <w:abstractNum w:abstractNumId="5" w15:restartNumberingAfterBreak="0">
-    <w:nsid w:val="2EF81232"/>
+    <w:nsid w:val="41F93620"/>
     <w:multiLevelType w:val="hybridMultilevel"/>
-    <w:tmpl w:val="8FFE7B52"/>
-    <w:lvl w:ilvl="0" w:tplc="6AEA0D16">
+    <w:tmpl w:val="689A625A"/>
+    <w:lvl w:ilvl="0" w:tplc="8DBAA69C">
       <w:start w:val="1"/>
       <w:numFmt w:val="decimal"/>
       <w:lvlText w:val="%1."/>
@@ -6349,52 +6379,52 @@
         <w:ind w:left="720" w:hanging="360"/>
       </w:pPr>
     </w:lvl>
-    <w:lvl w:ilvl="1" w:tplc="6BEE162C">
+    <w:lvl w:ilvl="1" w:tplc="3274DA2E">
       <w:numFmt w:val="decimal"/>
       <w:lvlText w:val=""/>
       <w:lvlJc w:val="left"/>
     </w:lvl>
-    <w:lvl w:ilvl="2" w:tplc="F98E6260">
+    <w:lvl w:ilvl="2" w:tplc="B684584C">
       <w:numFmt w:val="decimal"/>
       <w:lvlText w:val=""/>
       <w:lvlJc w:val="left"/>
     </w:lvl>
-    <w:lvl w:ilvl="3" w:tplc="6758FF8E">
+    <w:lvl w:ilvl="3" w:tplc="EB34A8DA">
       <w:numFmt w:val="decimal"/>
       <w:lvlText w:val=""/>
       <w:lvlJc w:val="left"/>
     </w:lvl>
-    <w:lvl w:ilvl="4" w:tplc="A4ACE4B6">
+    <w:lvl w:ilvl="4" w:tplc="2864F8AC">
       <w:numFmt w:val="decimal"/>
       <w:lvlText w:val=""/>
       <w:lvlJc w:val="left"/>
     </w:lvl>
-    <w:lvl w:ilvl="5" w:tplc="9D60F718">
+    <w:lvl w:ilvl="5" w:tplc="A08C90FC">
       <w:numFmt w:val="decimal"/>
       <w:lvlText w:val=""/>
       <w:lvlJc w:val="left"/>
     </w:lvl>
-    <w:lvl w:ilvl="6" w:tplc="E18674C8">
+    <w:lvl w:ilvl="6" w:tplc="BA2A8A46">
       <w:numFmt w:val="decimal"/>
       <w:lvlText w:val=""/>
       <w:lvlJc w:val="left"/>
     </w:lvl>
-    <w:lvl w:ilvl="7" w:tplc="B3A43804">
+    <w:lvl w:ilvl="7" w:tplc="113C9262">
       <w:numFmt w:val="decimal"/>
       <w:lvlText w:val=""/>
       <w:lvlJc w:val="left"/>
     </w:lvl>
-    <w:lvl w:ilvl="8" w:tplc="5ED0C18E">
+    <w:lvl w:ilvl="8" w:tplc="2E7EE0BE">
       <w:numFmt w:val="decimal"/>
       <w:lvlText w:val=""/>
       <w:lvlJc w:val="left"/>
     </w:lvl>
   </w:abstractNum>
   <w:abstractNum w:abstractNumId="6" w15:restartNumberingAfterBreak="0">
-    <w:nsid w:val="613E4E9C"/>
+    <w:nsid w:val="584E7BCA"/>
     <w:multiLevelType w:val="hybridMultilevel"/>
-    <w:tmpl w:val="145457D4"/>
-    <w:lvl w:ilvl="0" w:tplc="CE148A74">
+    <w:tmpl w:val="9240210E"/>
+    <w:lvl w:ilvl="0" w:tplc="7108C246">
       <w:start w:val="1"/>
       <w:numFmt w:val="decimal"/>
       <w:lvlText w:val="%1."/>
@@ -6403,52 +6433,52 @@
         <w:ind w:left="720" w:hanging="360"/>
       </w:pPr>
     </w:lvl>
-    <w:lvl w:ilvl="1" w:tplc="F97CD3C4">
+    <w:lvl w:ilvl="1" w:tplc="7894360A">
       <w:numFmt w:val="decimal"/>
       <w:lvlText w:val=""/>
       <w:lvlJc w:val="left"/>
     </w:lvl>
-    <w:lvl w:ilvl="2" w:tplc="AE384CA6">
+    <w:lvl w:ilvl="2" w:tplc="A1D8525C">
       <w:numFmt w:val="decimal"/>
       <w:lvlText w:val=""/>
       <w:lvlJc w:val="left"/>
     </w:lvl>
-    <w:lvl w:ilvl="3" w:tplc="F2289F86">
+    <w:lvl w:ilvl="3" w:tplc="187A68DE">
       <w:numFmt w:val="decimal"/>
       <w:lvlText w:val=""/>
       <w:lvlJc w:val="left"/>
     </w:lvl>
-    <w:lvl w:ilvl="4" w:tplc="6186A53A">
+    <w:lvl w:ilvl="4" w:tplc="7804AD94">
       <w:numFmt w:val="decimal"/>
       <w:lvlText w:val=""/>
       <w:lvlJc w:val="left"/>
     </w:lvl>
-    <w:lvl w:ilvl="5" w:tplc="2566015C">
+    <w:lvl w:ilvl="5" w:tplc="8F74BDCA">
       <w:numFmt w:val="decimal"/>
       <w:lvlText w:val=""/>
       <w:lvlJc w:val="left"/>
     </w:lvl>
-    <w:lvl w:ilvl="6" w:tplc="83CE1C22">
+    <w:lvl w:ilvl="6" w:tplc="9F8C5FBA">
       <w:numFmt w:val="decimal"/>
       <w:lvlText w:val=""/>
       <w:lvlJc w:val="left"/>
     </w:lvl>
-    <w:lvl w:ilvl="7" w:tplc="90466530">
+    <w:lvl w:ilvl="7" w:tplc="CD3E7098">
       <w:numFmt w:val="decimal"/>
       <w:lvlText w:val=""/>
       <w:lvlJc w:val="left"/>
     </w:lvl>
-    <w:lvl w:ilvl="8" w:tplc="58AE6604">
+    <w:lvl w:ilvl="8" w:tplc="EDB0F88A">
       <w:numFmt w:val="decimal"/>
       <w:lvlText w:val=""/>
       <w:lvlJc w:val="left"/>
     </w:lvl>
   </w:abstractNum>
   <w:abstractNum w:abstractNumId="7" w15:restartNumberingAfterBreak="0">
-    <w:nsid w:val="63AD2172"/>
+    <w:nsid w:val="616A779C"/>
     <w:multiLevelType w:val="hybridMultilevel"/>
-    <w:tmpl w:val="9B326A06"/>
-    <w:lvl w:ilvl="0" w:tplc="FF3AD9FE">
+    <w:tmpl w:val="FE6AC01A"/>
+    <w:lvl w:ilvl="0" w:tplc="2670DEA6">
       <w:start w:val="1"/>
       <w:numFmt w:val="decimal"/>
       <w:lvlText w:val="%1."/>
@@ -6457,52 +6487,52 @@
         <w:ind w:left="720" w:hanging="360"/>
       </w:pPr>
     </w:lvl>
-    <w:lvl w:ilvl="1" w:tplc="9D1E36D4">
+    <w:lvl w:ilvl="1" w:tplc="21AAECE2">
       <w:numFmt w:val="decimal"/>
       <w:lvlText w:val=""/>
       <w:lvlJc w:val="left"/>
     </w:lvl>
-    <w:lvl w:ilvl="2" w:tplc="D5C8DCD2">
+    <w:lvl w:ilvl="2" w:tplc="5A1A057C">
       <w:numFmt w:val="decimal"/>
       <w:lvlText w:val=""/>
       <w:lvlJc w:val="left"/>
     </w:lvl>
-    <w:lvl w:ilvl="3" w:tplc="F2A8A618">
+    <w:lvl w:ilvl="3" w:tplc="AA6CA714">
       <w:numFmt w:val="decimal"/>
       <w:lvlText w:val=""/>
       <w:lvlJc w:val="left"/>
     </w:lvl>
-    <w:lvl w:ilvl="4" w:tplc="95042A22">
+    <w:lvl w:ilvl="4" w:tplc="5132544A">
       <w:numFmt w:val="decimal"/>
       <w:lvlText w:val=""/>
       <w:lvlJc w:val="left"/>
     </w:lvl>
-    <w:lvl w:ilvl="5" w:tplc="E71C9C60">
+    <w:lvl w:ilvl="5" w:tplc="287EB66A">
       <w:numFmt w:val="decimal"/>
       <w:lvlText w:val=""/>
       <w:lvlJc w:val="left"/>
     </w:lvl>
-    <w:lvl w:ilvl="6" w:tplc="A3348336">
+    <w:lvl w:ilvl="6" w:tplc="A850A922">
       <w:numFmt w:val="decimal"/>
       <w:lvlText w:val=""/>
       <w:lvlJc w:val="left"/>
     </w:lvl>
-    <w:lvl w:ilvl="7" w:tplc="401A98DA">
+    <w:lvl w:ilvl="7" w:tplc="006A3706">
       <w:numFmt w:val="decimal"/>
       <w:lvlText w:val=""/>
       <w:lvlJc w:val="left"/>
     </w:lvl>
-    <w:lvl w:ilvl="8" w:tplc="8DA20190">
+    <w:lvl w:ilvl="8" w:tplc="5C3AAA66">
       <w:numFmt w:val="decimal"/>
       <w:lvlText w:val=""/>
       <w:lvlJc w:val="left"/>
     </w:lvl>
   </w:abstractNum>
   <w:abstractNum w:abstractNumId="8" w15:restartNumberingAfterBreak="0">
-    <w:nsid w:val="695242DC"/>
+    <w:nsid w:val="7241007F"/>
     <w:multiLevelType w:val="hybridMultilevel"/>
-    <w:tmpl w:val="72F8FAA4"/>
-    <w:lvl w:ilvl="0" w:tplc="FFE47DA4">
+    <w:tmpl w:val="6960F176"/>
+    <w:lvl w:ilvl="0" w:tplc="E4B247F8">
       <w:start w:val="1"/>
       <w:numFmt w:val="decimal"/>
       <w:lvlText w:val="%1."/>
@@ -6511,52 +6541,52 @@
         <w:ind w:left="720" w:hanging="360"/>
       </w:pPr>
     </w:lvl>
-    <w:lvl w:ilvl="1" w:tplc="6EC4C356">
+    <w:lvl w:ilvl="1" w:tplc="5E72D9F0">
       <w:numFmt w:val="decimal"/>
       <w:lvlText w:val=""/>
       <w:lvlJc w:val="left"/>
     </w:lvl>
-    <w:lvl w:ilvl="2" w:tplc="3AF089CE">
+    <w:lvl w:ilvl="2" w:tplc="742C2D5A">
       <w:numFmt w:val="decimal"/>
       <w:lvlText w:val=""/>
       <w:lvlJc w:val="left"/>
     </w:lvl>
-    <w:lvl w:ilvl="3" w:tplc="30E07026">
+    <w:lvl w:ilvl="3" w:tplc="54629628">
       <w:numFmt w:val="decimal"/>
       <w:lvlText w:val=""/>
       <w:lvlJc w:val="left"/>
     </w:lvl>
-    <w:lvl w:ilvl="4" w:tplc="F4E22D4A">
+    <w:lvl w:ilvl="4" w:tplc="00868046">
       <w:numFmt w:val="decimal"/>
       <w:lvlText w:val=""/>
       <w:lvlJc w:val="left"/>
     </w:lvl>
-    <w:lvl w:ilvl="5" w:tplc="C554D3DE">
+    <w:lvl w:ilvl="5" w:tplc="626A0C3C">
       <w:numFmt w:val="decimal"/>
       <w:lvlText w:val=""/>
       <w:lvlJc w:val="left"/>
     </w:lvl>
-    <w:lvl w:ilvl="6" w:tplc="825EF196">
+    <w:lvl w:ilvl="6" w:tplc="96083BE6">
       <w:numFmt w:val="decimal"/>
       <w:lvlText w:val=""/>
       <w:lvlJc w:val="left"/>
     </w:lvl>
-    <w:lvl w:ilvl="7" w:tplc="B596B1F2">
+    <w:lvl w:ilvl="7" w:tplc="503200BE">
       <w:numFmt w:val="decimal"/>
       <w:lvlText w:val=""/>
       <w:lvlJc w:val="left"/>
     </w:lvl>
-    <w:lvl w:ilvl="8" w:tplc="1BAAB36C">
+    <w:lvl w:ilvl="8" w:tplc="D46CE39E">
       <w:numFmt w:val="decimal"/>
       <w:lvlText w:val=""/>
       <w:lvlJc w:val="left"/>
     </w:lvl>
   </w:abstractNum>
   <w:abstractNum w:abstractNumId="9" w15:restartNumberingAfterBreak="0">
-    <w:nsid w:val="7ADA3F4D"/>
+    <w:nsid w:val="7C86039D"/>
     <w:multiLevelType w:val="hybridMultilevel"/>
-    <w:tmpl w:val="7868A820"/>
-    <w:lvl w:ilvl="0" w:tplc="68420BAC">
+    <w:tmpl w:val="8B62C6E8"/>
+    <w:lvl w:ilvl="0" w:tplc="3E0E25B2">
       <w:start w:val="1"/>
       <w:numFmt w:val="decimal"/>
       <w:lvlText w:val="%1."/>
@@ -6565,102 +6595,102 @@
         <w:ind w:left="720" w:hanging="360"/>
       </w:pPr>
     </w:lvl>
-    <w:lvl w:ilvl="1" w:tplc="3F6429A4">
+    <w:lvl w:ilvl="1" w:tplc="90267144">
       <w:numFmt w:val="decimal"/>
       <w:lvlText w:val=""/>
       <w:lvlJc w:val="left"/>
     </w:lvl>
-    <w:lvl w:ilvl="2" w:tplc="E7D0B098">
+    <w:lvl w:ilvl="2" w:tplc="C88C2B58">
       <w:numFmt w:val="decimal"/>
       <w:lvlText w:val=""/>
       <w:lvlJc w:val="left"/>
     </w:lvl>
-    <w:lvl w:ilvl="3" w:tplc="5992AD16">
+    <w:lvl w:ilvl="3" w:tplc="360CB4D2">
       <w:numFmt w:val="decimal"/>
       <w:lvlText w:val=""/>
       <w:lvlJc w:val="left"/>
     </w:lvl>
-    <w:lvl w:ilvl="4" w:tplc="9574F0EC">
+    <w:lvl w:ilvl="4" w:tplc="7D083D08">
       <w:numFmt w:val="decimal"/>
       <w:lvlText w:val=""/>
       <w:lvlJc w:val="left"/>
     </w:lvl>
-    <w:lvl w:ilvl="5" w:tplc="5788589C">
+    <w:lvl w:ilvl="5" w:tplc="C1821BC4">
       <w:numFmt w:val="decimal"/>
       <w:lvlText w:val=""/>
       <w:lvlJc w:val="left"/>
     </w:lvl>
-    <w:lvl w:ilvl="6" w:tplc="F39C5D86">
+    <w:lvl w:ilvl="6" w:tplc="A328A5CE">
       <w:numFmt w:val="decimal"/>
       <w:lvlText w:val=""/>
       <w:lvlJc w:val="left"/>
     </w:lvl>
-    <w:lvl w:ilvl="7" w:tplc="5C140222">
+    <w:lvl w:ilvl="7" w:tplc="7304D1D8">
       <w:numFmt w:val="decimal"/>
       <w:lvlText w:val=""/>
       <w:lvlJc w:val="left"/>
     </w:lvl>
-    <w:lvl w:ilvl="8" w:tplc="216A4F04">
+    <w:lvl w:ilvl="8" w:tplc="EF74ECB0">
       <w:numFmt w:val="decimal"/>
       <w:lvlText w:val=""/>
       <w:lvlJc w:val="left"/>
     </w:lvl>
   </w:abstractNum>
-  <w:num w:numId="1" w16cid:durableId="1793860662">
+  <w:num w:numId="1" w16cid:durableId="1891065531">
+    <w:abstractNumId w:val="3"/>
+    <w:lvlOverride w:ilvl="0">
+      <w:startOverride w:val="1"/>
+    </w:lvlOverride>
+  </w:num>
+  <w:num w:numId="2" w16cid:durableId="510224851">
+    <w:abstractNumId w:val="6"/>
+    <w:lvlOverride w:ilvl="0">
+      <w:startOverride w:val="1"/>
+    </w:lvlOverride>
+  </w:num>
+  <w:num w:numId="3" w16cid:durableId="612828514">
+    <w:abstractNumId w:val="5"/>
+    <w:lvlOverride w:ilvl="0">
+      <w:startOverride w:val="1"/>
+    </w:lvlOverride>
+  </w:num>
+  <w:num w:numId="4" w16cid:durableId="590433522">
+    <w:abstractNumId w:val="7"/>
+    <w:lvlOverride w:ilvl="0">
+      <w:startOverride w:val="1"/>
+    </w:lvlOverride>
+  </w:num>
+  <w:num w:numId="5" w16cid:durableId="1497956749">
+    <w:abstractNumId w:val="8"/>
+    <w:lvlOverride w:ilvl="0">
+      <w:startOverride w:val="1"/>
+    </w:lvlOverride>
+  </w:num>
+  <w:num w:numId="6" w16cid:durableId="1487475035">
     <w:abstractNumId w:val="0"/>
     <w:lvlOverride w:ilvl="0">
       <w:startOverride w:val="1"/>
     </w:lvlOverride>
   </w:num>
-  <w:num w:numId="2" w16cid:durableId="1191526799">
-    <w:abstractNumId w:val="6"/>
+  <w:num w:numId="7" w16cid:durableId="1134759695">
+    <w:abstractNumId w:val="4"/>
     <w:lvlOverride w:ilvl="0">
       <w:startOverride w:val="1"/>
     </w:lvlOverride>
   </w:num>
-  <w:num w:numId="3" w16cid:durableId="1667784856">
+  <w:num w:numId="8" w16cid:durableId="1810777888">
+    <w:abstractNumId w:val="1"/>
+    <w:lvlOverride w:ilvl="0">
+      <w:startOverride w:val="1"/>
+    </w:lvlOverride>
+  </w:num>
+  <w:num w:numId="9" w16cid:durableId="858080371">
     <w:abstractNumId w:val="2"/>
     <w:lvlOverride w:ilvl="0">
       <w:startOverride w:val="1"/>
     </w:lvlOverride>
   </w:num>
-  <w:num w:numId="4" w16cid:durableId="1494755244">
-    <w:abstractNumId w:val="1"/>
-    <w:lvlOverride w:ilvl="0">
-      <w:startOverride w:val="1"/>
-    </w:lvlOverride>
-  </w:num>
-  <w:num w:numId="5" w16cid:durableId="716855012">
-    <w:abstractNumId w:val="5"/>
-    <w:lvlOverride w:ilvl="0">
-      <w:startOverride w:val="1"/>
-    </w:lvlOverride>
-  </w:num>
-  <w:num w:numId="6" w16cid:durableId="709064755">
-    <w:abstractNumId w:val="8"/>
-    <w:lvlOverride w:ilvl="0">
-      <w:startOverride w:val="1"/>
-    </w:lvlOverride>
-  </w:num>
-  <w:num w:numId="7" w16cid:durableId="309677111">
-    <w:abstractNumId w:val="4"/>
-    <w:lvlOverride w:ilvl="0">
-      <w:startOverride w:val="1"/>
-    </w:lvlOverride>
-  </w:num>
-  <w:num w:numId="8" w16cid:durableId="1169172534">
-    <w:abstractNumId w:val="7"/>
-    <w:lvlOverride w:ilvl="0">
-      <w:startOverride w:val="1"/>
-    </w:lvlOverride>
-  </w:num>
-  <w:num w:numId="9" w16cid:durableId="1302231691">
-    <w:abstractNumId w:val="3"/>
-    <w:lvlOverride w:ilvl="0">
-      <w:startOverride w:val="1"/>
-    </w:lvlOverride>
-  </w:num>
-  <w:num w:numId="10" w16cid:durableId="100148721">
+  <w:num w:numId="10" w16cid:durableId="746070421">
     <w:abstractNumId w:val="9"/>
     <w:lvlOverride w:ilvl="0">
       <w:startOverride w:val="1"/>

</xml_diff>